<commit_message>
docs: asigna Product Owner y Scrum Master del equipo
Product Owner: Osmar Emilio Solís Olivares. Scrum Master: Isela Esmeralda
Guerrero Martínez. Reemplaza a Alonso David de León Rodarte como PO y cierra
el rol de Scrum Master, antes "por asignar", en 07-metodologia.md,
09-carta-patrocinadora.md, sprint-01.md y la carta sponsor en Word.
</commit_message>
<xml_diff>
--- a/docs/gestion/carta-patrocinadora.docx
+++ b/docs/gestion/carta-patrocinadora.docx
@@ -714,7 +714,7 @@
           <w:b/>
           <w:bCs/>
         </w:rPr>
-        <w:t xml:space="preserve">Product Owner asignado; Scrum Master pendiente.</w:t>
+        <w:t xml:space="preserve">Product Owner y Scrum Master asignados.</w:t>
       </w:r>
     </w:p>
     <w:tbl>
@@ -820,7 +820,7 @@
                 <w:b w:val="false"/>
                 <w:bCs w:val="false"/>
               </w:rPr>
-              <w:t xml:space="preserve">Alonso David de León Rodarte</w:t>
+              <w:t xml:space="preserve">Osmar Emilio Solís Olivares</w:t>
             </w:r>
           </w:p>
         </w:tc>
@@ -864,7 +864,7 @@
                 <w:b w:val="false"/>
                 <w:bCs w:val="false"/>
               </w:rPr>
-              <w:t xml:space="preserve">Por asignar</w:t>
+              <w:t xml:space="preserve">Isela Esmeralda Guerrero Martínez</w:t>
             </w:r>
           </w:p>
         </w:tc>
@@ -923,7 +923,7 @@
           <w:i/>
           <w:iCs/>
         </w:rPr>
-        <w:t xml:space="preserve">En equipo de 6, PO y Scrum Master también pueden tomar tareas de desarrollo. Alonso es PO y developer a la vez: no autoaprueba su propio código, otra persona del equipo revisa igual.</w:t>
+        <w:t xml:space="preserve">En equipo de 6, PO y Scrum Master también pueden tomar tareas de desarrollo. Osmar es PO y developer a la vez: no autoaprueba su propio código, otra persona del equipo revisa igual.</w:t>
       </w:r>
     </w:p>
     <w:p>
@@ -1286,7 +1286,7 @@
                 <w:b w:val="false"/>
                 <w:bCs w:val="false"/>
               </w:rPr>
-              <w:t xml:space="preserve">Alonso David de León Rodarte</w:t>
+              <w:t xml:space="preserve">Osmar Emilio Solís Olivares</w:t>
             </w:r>
           </w:p>
         </w:tc>
@@ -1344,7 +1344,7 @@
                 <w:b w:val="false"/>
                 <w:bCs w:val="false"/>
               </w:rPr>
-              <w:t xml:space="preserve">Por asignar</w:t>
+              <w:t xml:space="preserve">Isela Esmeralda Guerrero Martínez</w:t>
             </w:r>
           </w:p>
         </w:tc>

</xml_diff>